<commit_message>
Regenerate the sample walkthrough docx from the corrected guide
Co-authored-by: CommandCodeBot <noreply@commandcode.ai>
</commit_message>
<xml_diff>
--- a/SAMPLE_TEST_GUIDE.docx
+++ b/SAMPLE_TEST_GUIDE.docx
@@ -6118,10 +6118,10 @@
         <w:rPr>
           <w:b/>
         </w:rPr>
-        <w:t>Try this too:</w:t>
-      </w:r>
-      <w:r>
-        <w:t xml:space="preserve"> reverse the </w:t>
+        <w:t>Try a refusal.</w:t>
+      </w:r>
+      <w:r>
+        <w:t xml:space="preserve"> Reversing the </w:t>
       </w:r>
       <w:r>
         <w:rPr>
@@ -6130,7 +6130,101 @@
         <w:t>purchase</w:t>
       </w:r>
       <w:r>
-        <w:t xml:space="preserve"> from Step 1. It will be refused, because those materials have since been consumed in production — the message names the item and the quantity on hand.</w:t>
+        <w:t xml:space="preserve"> from Step 1 is *allowed* here — you still hold 140 kg of </w:t>
+      </w:r>
+      <w:r>
+        <w:rPr>
+          <w:rFonts w:ascii="Consolas" w:hAnsi="Consolas"/>
+          <w:color w:val="1D4ED8"/>
+          <w:sz w:val="19"/>
+        </w:rPr>
+        <w:t>RM-100</w:t>
+      </w:r>
+      <w:r>
+        <w:t xml:space="preserve"> against the 100 kg you bought, so the stock can go back without going negative. The rule is simple: a reversal is refused only when the quantity to take back is </w:t>
+      </w:r>
+      <w:r>
+        <w:rPr>
+          <w:b/>
+        </w:rPr>
+        <w:t>more than you still hold</w:t>
+      </w:r>
+      <w:r>
+        <w:t>.</w:t>
+      </w:r>
+    </w:p>
+    <w:p>
+      <w:r>
+        <w:t>To see a refusal, do it in this order instead:</w:t>
+      </w:r>
+    </w:p>
+    <w:p>
+      <w:pPr>
+        <w:pStyle w:val="ListNumber"/>
+        <w:spacing w:after="40"/>
+      </w:pPr>
+      <w:r>
+        <w:t xml:space="preserve">Do </w:t>
+      </w:r>
+      <w:r>
+        <w:rPr>
+          <w:b/>
+        </w:rPr>
+        <w:t>not</w:t>
+      </w:r>
+      <w:r>
+        <w:t xml:space="preserve"> reverse the sale yet.</w:t>
+      </w:r>
+    </w:p>
+    <w:p>
+      <w:pPr>
+        <w:pStyle w:val="ListNumber"/>
+        <w:spacing w:after="40"/>
+      </w:pPr>
+      <w:r>
+        <w:t xml:space="preserve">With the sale still posted, try to reverse the </w:t>
+      </w:r>
+      <w:r>
+        <w:rPr>
+          <w:b/>
+        </w:rPr>
+        <w:t>production run</w:t>
+      </w:r>
+      <w:r>
+        <w:t xml:space="preserve"> from Step 2.</w:t>
+      </w:r>
+    </w:p>
+    <w:p>
+      <w:pPr>
+        <w:pStyle w:val="ListNumber"/>
+        <w:spacing w:after="40"/>
+      </w:pPr>
+      <w:r>
+        <w:t>It is refused, because the finished goods it produced have since been sold. The</w:t>
+      </w:r>
+    </w:p>
+    <w:p>
+      <w:r>
+        <w:t>message names the item and the quantity on hand.</w:t>
+      </w:r>
+    </w:p>
+    <w:p>
+      <w:pPr>
+        <w:pStyle w:val="ListNumber"/>
+        <w:spacing w:after="40"/>
+      </w:pPr>
+      <w:r>
+        <w:t>Reverse the sale first — then the production run can be reversed.</w:t>
+      </w:r>
+    </w:p>
+    <w:p>
+      <w:pPr>
+        <w:spacing w:before="80" w:after="160"/>
+        <w:ind w:left="240"/>
+        <w:shd w:val="clear" w:color="auto" w:fill="F4F6F8"/>
+      </w:pPr>
+      <w:r>
+        <w:t>Reversals are recorded in the order you make them, however old the transaction they correct. The stock ledger shows them that way, so the running balance always reads correctly.</w:t>
       </w:r>
     </w:p>
     <w:p>

</xml_diff>